<commit_message>
feat: define chip-to-cluster architecture and module scaffold
</commit_message>
<xml_diff>
--- a/docs/UniverseModel_Heterogeneous_Cluster_Plan.docx
+++ b/docs/UniverseModel_Heterogeneous_Cluster_Plan.docx
@@ -25,7 +25,7 @@
     </w:p>
     <w:p>
       <w:r>
-        <w:t>本规划中的 HBF 指 High Bandwidth Flash；duo die 按双裸片 Dual-Die 处理。新增模块及接口均为后续实现方案；本文不代表这些模型已经实现。</w:t>
+        <w:t>本规划中的 HBF 指 High Bandwidth Flash；duo die 按双裸片 Dual-Die 处理。相关模块目录与设计文档现已建立，执行接口和模型仍待实现。当前模块边界以 docs/architecture/design.md 和 modules.json 为准。</w:t>
       </w:r>
     </w:p>
     <w:p>
@@ -41,7 +41,7 @@
         <w:keepNext/>
       </w:pPr>
       <w:r>
-        <w:t>建议增加 systemmodel 和 clustermodel，并将 chipmodel 的组合范围明确到封装。多核放在 chipmodel 内；板卡、节点和集群按各自管理的资源与共享瓶颈建模。这样可以在单芯片模型成熟后复用它，也可以用粗粒度设备模型先开展系统实验。</w:t>
+        <w:t>工程已增加 systemmodel 和 clustermodel 的结构，将 chipmodel 的组合范围明确到封装。多核放在 chipmodel 内；板卡、节点和集群按各自管理的资源与共享瓶颈建模。这样可以在单芯片模型成熟后复用它，也可以用粗粒度设备模型先开展系统实验。</w:t>
       </w:r>
     </w:p>
     <w:tbl>
@@ -2914,7 +2914,7 @@
     </w:p>
     <w:p>
       <w:r>
-        <w:t>建议的配置位置为 config/hardware/components、chips、systems、clusters，以及独立 config/costs。它们是按职责组织的配置文件目录；组件模板与实例引用关系才决定实际架构。</w:t>
+        <w:t>配置目录为 config/hardware/components、chips、systems、clusters，以及独立 config/costs。它们是按职责组织的配置文件目录；组件模板与实例引用关系才决定实际架构。</w:t>
       </w:r>
     </w:p>
     <w:p>
@@ -3819,7 +3819,7 @@
         <w:keepNext/>
       </w:pPr>
       <w:r>
-        <w:t>先固定接口和最小可执行路径，再扩大物理范围。各层支持摘要模型，因此单卡系统实验与详细 CIM 研究可以共享接口并独立推进。</w:t>
+        <w:t>先固定接口和最小可执行路径，再扩大物理范围。下表 S1–S7 是异构扩展的工作分解；总体实现门槛使用 docs/architecture/validation.md 中的 A–F，两者分别编号。各层支持摘要模型，单卡系统实验与详细 CIM 研究可共享接口并独立推进。</w:t>
       </w:r>
     </w:p>
     <w:tbl>
@@ -3927,7 +3927,7 @@
               <w:jc w:val="center"/>
             </w:pPr>
             <w:r>
-              <w:t>A</w:t>
+              <w:t>S1</w:t>
             </w:r>
           </w:p>
         </w:tc>
@@ -3975,7 +3975,7 @@
               <w:jc w:val="center"/>
             </w:pPr>
             <w:r>
-              <w:t>B</w:t>
+              <w:t>S2</w:t>
             </w:r>
           </w:p>
         </w:tc>
@@ -4023,7 +4023,7 @@
               <w:jc w:val="center"/>
             </w:pPr>
             <w:r>
-              <w:t>C</w:t>
+              <w:t>S3</w:t>
             </w:r>
           </w:p>
         </w:tc>
@@ -4071,7 +4071,7 @@
               <w:jc w:val="center"/>
             </w:pPr>
             <w:r>
-              <w:t>D</w:t>
+              <w:t>S4</w:t>
             </w:r>
           </w:p>
         </w:tc>
@@ -4119,7 +4119,7 @@
               <w:jc w:val="center"/>
             </w:pPr>
             <w:r>
-              <w:t>E</w:t>
+              <w:t>S5</w:t>
             </w:r>
           </w:p>
         </w:tc>
@@ -4167,7 +4167,7 @@
               <w:jc w:val="center"/>
             </w:pPr>
             <w:r>
-              <w:t>F</w:t>
+              <w:t>S6</w:t>
             </w:r>
           </w:p>
         </w:tc>
@@ -4215,7 +4215,7 @@
               <w:jc w:val="center"/>
             </w:pPr>
             <w:r>
-              <w:t>G</w:t>
+              <w:t>S7</w:t>
             </w:r>
           </w:p>
         </w:tc>
@@ -4261,7 +4261,7 @@
     </w:p>
     <w:p>
       <w:r>
-        <w:t>阶段 C 的 3D CIM 电路细化和阶段 D 的节点组合可以在接口固定后分别推进，不要求先具备完整晶体管级模型。首个集群闭环采用 2 节点，每节点控制 CPU 加 2 个加速设备，以小规模点对点和 AllReduce 验证通信。设备类型可从两个相同设备逐步替换为 GPU 与 CIM；生产规模数量通过配置扩展。</w:t>
+        <w:t>S3 的 3D CIM 电路细化和 S4 的节点组合可以在接口固定后分别推进，不要求先具备完整晶体管级模型。首个集群闭环采用 2 节点，每节点控制 CPU 加 2 个加速设备，以小规模点对点和 AllReduce 验证通信。设备类型可从两个相同设备逐步替换为 GPU 与 CIM；生产规模数量通过配置扩展。</w:t>
       </w:r>
     </w:p>
     <w:p>
@@ -4348,12 +4348,12 @@
         <w:pStyle w:val="Heading1"/>
       </w:pPr>
       <w:r>
-        <w:t>10 建议的目录演进</w:t>
+        <w:t>10 目录与实现位置</w:t>
       </w:r>
     </w:p>
     <w:p>
       <w:r>
-        <w:t>以下是后续实现位置；现有 chipmodel/compute、memory、interconnect、control 保留。目录是代码职责划分，实际资源组成由配置决定。</w:t>
+        <w:t>以下目录已建立，作为后续执行模型的实现位置；原有 chipmodel/compute、memory、interconnect、control 保留。目录是代码职责划分，实际资源组成由配置决定。</w:t>
       </w:r>
     </w:p>
     <w:p>
@@ -4425,7 +4425,7 @@
         <w:pStyle w:val="CodeBlock"/>
       </w:pPr>
       <w:r>
-        <w:t xml:space="preserve">  composition/      Board Card Socket Node</w:t>
+        <w:t xml:space="preserve">  composition/      Board Card Node</w:t>
       </w:r>
     </w:p>
     <w:p>
@@ -4449,7 +4449,7 @@
         <w:pStyle w:val="CodeBlock"/>
       </w:pPr>
       <w:r>
-        <w:t xml:space="preserve">  composition/      Cluster Rack Pod 与分组</w:t>
+        <w:t xml:space="preserve">  composition/      Cluster 与资源分组</w:t>
       </w:r>
     </w:p>
     <w:p>
@@ -4497,7 +4497,31 @@
         <w:pStyle w:val="CodeBlock"/>
       </w:pPr>
       <w:r>
-        <w:t>configuration/      参数字典 解析 校验与快照</w:t>
+        <w:t>configuration/      参数字典 解析 校验与冻结</w:t>
+      </w:r>
+    </w:p>
+    <w:p>
+      <w:pPr>
+        <w:pStyle w:val="CodeBlock"/>
+      </w:pPr>
+      <w:r>
+        <w:t>costmodel/          条件成本 特征化与不确定性</w:t>
+      </w:r>
+    </w:p>
+    <w:p>
+      <w:pPr>
+        <w:pStyle w:val="CodeBlock"/>
+      </w:pPr>
+      <w:r>
+        <w:t>artifacts/          清单 序列化 存储与来源</w:t>
+      </w:r>
+    </w:p>
+    <w:p>
+      <w:pPr>
+        <w:pStyle w:val="CodeBlock"/>
+      </w:pPr>
+      <w:r>
+        <w:t>ui/                 参数表单 拓扑 映射与时序视图</w:t>
       </w:r>
     </w:p>
     <w:p>
@@ -4507,7 +4531,7 @@
     </w:p>
     <w:p>
       <w:r>
-        <w:t>现有 compiler/src/globalsplit、globalsolver、tiling、memplan、sched、lowering 和 export 按阶段扩展跨设备支持，不立即复制一套集群编译器。现有 simulator 和 evaluation 继续承担统一执行、实验管理与结果分析。新目录在相应阶段有实际实现时建立。</w:t>
+        <w:t>现有 compiler/src/globalsplit、globalsolver、tiling、memplan、sched、lowering 和 export 按阶段扩展跨设备支持，不立即复制一套集群编译器。现有 simulator 和 evaluation 继续承担统一执行、实验管理与结果分析。主模块的 README.md 与 docs/design.md 说明子目录、状态、输入输出和验证责任；本次建立结构，不代表已完成执行实现。</w:t>
       </w:r>
     </w:p>
     <w:p>

</xml_diff>